<commit_message>
Simplify margin-reduction rule to a single 60/40 Gross Profit split
Replaces the flat reduced-rate revenue tier table (which cut commission
disproportionately regardless of how far under margin a deal fell) with
one consolidated rule: quotes below 30% Gross Margin (was 40%) pay
commission as 40% of actual Gross Profit, MMG retains 60%. This scales
smoothly with how thin the margin is instead of a flat penalty, and
removes the duplicated reduced-margin references throughout the doc.

Co-Authored-By: Claude Fable 5 <noreply@anthropic.com>
Claude-Session: https://claude.ai/code/session_019EoJuzBaRKmij9AN1LjC6F
</commit_message>
<xml_diff>
--- a/docs/mmg/sales-compensation/MMG - Sales Commission Agreement - ALT Revenue-Based - v1.docx
+++ b/docs/mmg/sales-compensation/MMG - Sales Commission Agreement - ALT Revenue-Based - v1.docx
@@ -136,7 +136,7 @@
           <w:sz w:val="20"/>
           <w:szCs w:val="20"/>
         </w:rPr>
-        <w:t xml:space="preserve">It runs alongside MMG's Commissionable-Gross-Profit (CGP) plan as a separate option under evaluation. The starting rates below (10% / 12% / 15%, and the reduced-rate schedule) are placeholders sized to land close to the CGP plan's blended economics — confirm or adjust before this is finalized.</w:t>
+        <w:t xml:space="preserve">It runs alongside MMG's Commissionable-Gross-Profit (CGP) plan as a separate option under evaluation. The starting rates below (10% / 12% / 15%) are placeholders sized to land close to the CGP plan's blended economics — confirm or adjust before this is finalized.</w:t>
       </w:r>
     </w:p>
     <w:p>
@@ -574,7 +574,7 @@
           <w:sz w:val="21"/>
           <w:szCs w:val="21"/>
         </w:rPr>
-        <w:t xml:space="preserve"> the proposal is sent to the customer. No commission accrues on any engagement lacking Margin Integrity Approval, regardless of Gross Margin %.</w:t>
+        <w:t xml:space="preserve"> the proposal is sent to the customer. No commission accrues on any engagement lacking Margin Integrity Approval.</w:t>
       </w:r>
     </w:p>
     <w:p>
@@ -774,7 +774,7 @@
           <w:sz w:val="21"/>
           <w:szCs w:val="21"/>
         </w:rPr>
-        <w:t xml:space="preserve">means the tier rate(s) set out in Section 4.2 (or, where the Gross Margin % is below 40%, the reduced rate(s) set out in Section 4.4), applied to Approved Contract Value (Revenue).</w:t>
+        <w:t xml:space="preserve">means the tier rate(s) set out in Section 4.2, applied to Approved Contract Value (Revenue) — except that Section 4.4 applies instead for any engagement with a Gross Margin % below 30%.</w:t>
       </w:r>
     </w:p>
     <w:p>
@@ -834,7 +834,7 @@
           <w:sz w:val="20"/>
           <w:szCs w:val="20"/>
         </w:rPr>
-        <w:t xml:space="preserve">Commission is a percentage of the deal's revenue, not its profit. Before any quote goes to the customer, Bill reviews the quoted margin and signs off — that Margin Integrity Approval is what locks in the commission rate. If the quoted margin comes in under 40%, the rate is reduced instead of paid at the standard schedule. Once approved, none of this changes based on how the project actually performs.</w:t>
+        <w:t xml:space="preserve">Commission is a percentage of the deal's revenue, not its profit. Before any quote goes to the customer, Bill reviews the quoted margin and signs off — that Margin Integrity Approval is what locks in the commission rate. If the quoted margin comes in under 30%, commission switches to a straight 60/40 split of the actual Gross Profit instead (MMG 60%, Sales Representative 40%) — see Section 4.4. Once approved, none of this changes based on how the project actually performs.</w:t>
       </w:r>
     </w:p>
     <w:p>
@@ -859,7 +859,7 @@
     </w:p>
     <w:tbl>
       <w:tblPr>
-        <w:tblW w:type="dxa" w:w="7500"/>
+        <w:tblW w:type="dxa" w:w="8000"/>
         <w:tblBorders>
           <w:top w:val="single" w:color="auto" w:sz="4"/>
           <w:left w:val="single" w:color="auto" w:sz="4"/>
@@ -870,14 +870,13 @@
         </w:tblBorders>
       </w:tblPr>
       <w:tblGrid>
-        <w:gridCol w:w="2500"/>
-        <w:gridCol w:w="2500"/>
-        <w:gridCol w:w="2500"/>
+        <w:gridCol w:w="4000"/>
+        <w:gridCol w:w="4000"/>
       </w:tblGrid>
       <w:tr>
         <w:tc>
           <w:tcPr>
-            <w:tcW w:type="dxa" w:w="2500"/>
+            <w:tcW w:type="dxa" w:w="4000"/>
             <w:shd w:fill="1D1D1B" w:val="clear"/>
             <w:tcMar>
               <w:top w:type="dxa" w:w="80"/>
@@ -902,7 +901,7 @@
         </w:tc>
         <w:tc>
           <w:tcPr>
-            <w:tcW w:type="dxa" w:w="2500"/>
+            <w:tcW w:type="dxa" w:w="4000"/>
             <w:shd w:fill="1D1D1B" w:val="clear"/>
             <w:tcMar>
               <w:top w:type="dxa" w:w="80"/>
@@ -921,14 +920,166 @@
                 <w:sz w:val="20"/>
                 <w:szCs w:val="20"/>
               </w:rPr>
-              <w:t xml:space="preserve">Standard-Margin Example</w:t>
-            </w:r>
-          </w:p>
-        </w:tc>
-        <w:tc>
-          <w:tcPr>
-            <w:tcW w:type="dxa" w:w="2500"/>
-            <w:shd w:fill="1D1D1B" w:val="clear"/>
+              <w:t xml:space="preserve">Amount</w:t>
+            </w:r>
+          </w:p>
+        </w:tc>
+      </w:tr>
+      <w:tr>
+        <w:tc>
+          <w:tcPr>
+            <w:tcW w:type="dxa" w:w="4000"/>
+            <w:tcMar>
+              <w:top w:type="dxa" w:w="80"/>
+              <w:left w:type="dxa" w:w="120"/>
+              <w:bottom w:type="dxa" w:w="80"/>
+              <w:right w:type="dxa" w:w="120"/>
+            </w:tcMar>
+          </w:tcPr>
+          <w:p>
+            <w:r>
+              <w:rPr>
+                <w:rFonts w:ascii="Open Sans" w:cs="Open Sans" w:eastAsia="Open Sans" w:hAnsi="Open Sans"/>
+                <w:b w:val="false"/>
+                <w:bCs w:val="false"/>
+                <w:color w:val="1D1D1B"/>
+                <w:sz w:val="20"/>
+                <w:szCs w:val="20"/>
+              </w:rPr>
+              <w:t xml:space="preserve">Approved Contract Value (Sales Price)</w:t>
+            </w:r>
+          </w:p>
+        </w:tc>
+        <w:tc>
+          <w:tcPr>
+            <w:tcW w:type="dxa" w:w="4000"/>
+            <w:tcMar>
+              <w:top w:type="dxa" w:w="80"/>
+              <w:left w:type="dxa" w:w="120"/>
+              <w:bottom w:type="dxa" w:w="80"/>
+              <w:right w:type="dxa" w:w="120"/>
+            </w:tcMar>
+          </w:tcPr>
+          <w:p>
+            <w:r>
+              <w:rPr>
+                <w:rFonts w:ascii="Open Sans" w:cs="Open Sans" w:eastAsia="Open Sans" w:hAnsi="Open Sans"/>
+                <w:b w:val="false"/>
+                <w:bCs w:val="false"/>
+                <w:color w:val="1D1D1B"/>
+                <w:sz w:val="20"/>
+                <w:szCs w:val="20"/>
+              </w:rPr>
+              <w:t xml:space="preserve">$100,000</w:t>
+            </w:r>
+          </w:p>
+        </w:tc>
+      </w:tr>
+      <w:tr>
+        <w:tc>
+          <w:tcPr>
+            <w:tcW w:type="dxa" w:w="4000"/>
+            <w:tcMar>
+              <w:top w:type="dxa" w:w="80"/>
+              <w:left w:type="dxa" w:w="120"/>
+              <w:bottom w:type="dxa" w:w="80"/>
+              <w:right w:type="dxa" w:w="120"/>
+            </w:tcMar>
+          </w:tcPr>
+          <w:p>
+            <w:r>
+              <w:rPr>
+                <w:rFonts w:ascii="Open Sans" w:cs="Open Sans" w:eastAsia="Open Sans" w:hAnsi="Open Sans"/>
+                <w:b w:val="false"/>
+                <w:bCs w:val="false"/>
+                <w:color w:val="1D1D1B"/>
+                <w:sz w:val="20"/>
+                <w:szCs w:val="20"/>
+              </w:rPr>
+              <w:t xml:space="preserve">Approved Direct Delivery Costs</w:t>
+            </w:r>
+          </w:p>
+        </w:tc>
+        <w:tc>
+          <w:tcPr>
+            <w:tcW w:type="dxa" w:w="4000"/>
+            <w:tcMar>
+              <w:top w:type="dxa" w:w="80"/>
+              <w:left w:type="dxa" w:w="120"/>
+              <w:bottom w:type="dxa" w:w="80"/>
+              <w:right w:type="dxa" w:w="120"/>
+            </w:tcMar>
+          </w:tcPr>
+          <w:p>
+            <w:r>
+              <w:rPr>
+                <w:rFonts w:ascii="Open Sans" w:cs="Open Sans" w:eastAsia="Open Sans" w:hAnsi="Open Sans"/>
+                <w:b w:val="false"/>
+                <w:bCs w:val="false"/>
+                <w:color w:val="1D1D1B"/>
+                <w:sz w:val="20"/>
+                <w:szCs w:val="20"/>
+              </w:rPr>
+              <w:t xml:space="preserve">$55,000</w:t>
+            </w:r>
+          </w:p>
+        </w:tc>
+      </w:tr>
+      <w:tr>
+        <w:tc>
+          <w:tcPr>
+            <w:tcW w:type="dxa" w:w="4000"/>
+            <w:tcMar>
+              <w:top w:type="dxa" w:w="80"/>
+              <w:left w:type="dxa" w:w="120"/>
+              <w:bottom w:type="dxa" w:w="80"/>
+              <w:right w:type="dxa" w:w="120"/>
+            </w:tcMar>
+          </w:tcPr>
+          <w:p>
+            <w:r>
+              <w:rPr>
+                <w:rFonts w:ascii="Open Sans" w:cs="Open Sans" w:eastAsia="Open Sans" w:hAnsi="Open Sans"/>
+                <w:b w:val="false"/>
+                <w:bCs w:val="false"/>
+                <w:color w:val="1D1D1B"/>
+                <w:sz w:val="20"/>
+                <w:szCs w:val="20"/>
+              </w:rPr>
+              <w:t xml:space="preserve">Gross Margin %</w:t>
+            </w:r>
+          </w:p>
+        </w:tc>
+        <w:tc>
+          <w:tcPr>
+            <w:tcW w:type="dxa" w:w="4000"/>
+            <w:tcMar>
+              <w:top w:type="dxa" w:w="80"/>
+              <w:left w:type="dxa" w:w="120"/>
+              <w:bottom w:type="dxa" w:w="80"/>
+              <w:right w:type="dxa" w:w="120"/>
+            </w:tcMar>
+          </w:tcPr>
+          <w:p>
+            <w:r>
+              <w:rPr>
+                <w:rFonts w:ascii="Open Sans" w:cs="Open Sans" w:eastAsia="Open Sans" w:hAnsi="Open Sans"/>
+                <w:b w:val="false"/>
+                <w:bCs w:val="false"/>
+                <w:color w:val="1D1D1B"/>
+                <w:sz w:val="20"/>
+                <w:szCs w:val="20"/>
+              </w:rPr>
+              <w:t xml:space="preserve">45%</w:t>
+            </w:r>
+          </w:p>
+        </w:tc>
+      </w:tr>
+      <w:tr>
+        <w:tc>
+          <w:tcPr>
+            <w:tcW w:type="dxa" w:w="4000"/>
+            <w:shd w:fill="FFE4EA" w:val="clear"/>
             <w:tcMar>
               <w:top w:type="dxa" w:w="80"/>
               <w:left w:type="dxa" w:w="120"/>
@@ -942,241 +1093,17 @@
                 <w:rFonts w:ascii="Open Sans" w:cs="Open Sans" w:eastAsia="Open Sans" w:hAnsi="Open Sans"/>
                 <w:b/>
                 <w:bCs/>
-                <w:color w:val="FFFFFF"/>
-                <w:sz w:val="20"/>
-                <w:szCs w:val="20"/>
-              </w:rPr>
-              <w:t xml:space="preserve">Thin-Margin Example</w:t>
-            </w:r>
-          </w:p>
-        </w:tc>
-      </w:tr>
-      <w:tr>
-        <w:tc>
-          <w:tcPr>
-            <w:tcW w:type="dxa" w:w="2500"/>
-            <w:tcMar>
-              <w:top w:type="dxa" w:w="80"/>
-              <w:left w:type="dxa" w:w="120"/>
-              <w:bottom w:type="dxa" w:w="80"/>
-              <w:right w:type="dxa" w:w="120"/>
-            </w:tcMar>
-          </w:tcPr>
-          <w:p>
-            <w:r>
-              <w:rPr>
-                <w:rFonts w:ascii="Open Sans" w:cs="Open Sans" w:eastAsia="Open Sans" w:hAnsi="Open Sans"/>
-                <w:b w:val="false"/>
-                <w:bCs w:val="false"/>
-                <w:color w:val="1D1D1B"/>
-                <w:sz w:val="20"/>
-                <w:szCs w:val="20"/>
-              </w:rPr>
-              <w:t xml:space="preserve">Approved Contract Value (Sales Price)</w:t>
-            </w:r>
-          </w:p>
-        </w:tc>
-        <w:tc>
-          <w:tcPr>
-            <w:tcW w:type="dxa" w:w="2500"/>
-            <w:tcMar>
-              <w:top w:type="dxa" w:w="80"/>
-              <w:left w:type="dxa" w:w="120"/>
-              <w:bottom w:type="dxa" w:w="80"/>
-              <w:right w:type="dxa" w:w="120"/>
-            </w:tcMar>
-          </w:tcPr>
-          <w:p>
-            <w:r>
-              <w:rPr>
-                <w:rFonts w:ascii="Open Sans" w:cs="Open Sans" w:eastAsia="Open Sans" w:hAnsi="Open Sans"/>
-                <w:b w:val="false"/>
-                <w:bCs w:val="false"/>
-                <w:color w:val="1D1D1B"/>
-                <w:sz w:val="20"/>
-                <w:szCs w:val="20"/>
-              </w:rPr>
-              <w:t xml:space="preserve">$100,000</w:t>
-            </w:r>
-          </w:p>
-        </w:tc>
-        <w:tc>
-          <w:tcPr>
-            <w:tcW w:type="dxa" w:w="2500"/>
-            <w:tcMar>
-              <w:top w:type="dxa" w:w="80"/>
-              <w:left w:type="dxa" w:w="120"/>
-              <w:bottom w:type="dxa" w:w="80"/>
-              <w:right w:type="dxa" w:w="120"/>
-            </w:tcMar>
-          </w:tcPr>
-          <w:p>
-            <w:r>
-              <w:rPr>
-                <w:rFonts w:ascii="Open Sans" w:cs="Open Sans" w:eastAsia="Open Sans" w:hAnsi="Open Sans"/>
-                <w:b w:val="false"/>
-                <w:bCs w:val="false"/>
-                <w:color w:val="1D1D1B"/>
-                <w:sz w:val="20"/>
-                <w:szCs w:val="20"/>
-              </w:rPr>
-              <w:t xml:space="preserve">$100,000</w:t>
-            </w:r>
-          </w:p>
-        </w:tc>
-      </w:tr>
-      <w:tr>
-        <w:tc>
-          <w:tcPr>
-            <w:tcW w:type="dxa" w:w="2500"/>
-            <w:tcMar>
-              <w:top w:type="dxa" w:w="80"/>
-              <w:left w:type="dxa" w:w="120"/>
-              <w:bottom w:type="dxa" w:w="80"/>
-              <w:right w:type="dxa" w:w="120"/>
-            </w:tcMar>
-          </w:tcPr>
-          <w:p>
-            <w:r>
-              <w:rPr>
-                <w:rFonts w:ascii="Open Sans" w:cs="Open Sans" w:eastAsia="Open Sans" w:hAnsi="Open Sans"/>
-                <w:b w:val="false"/>
-                <w:bCs w:val="false"/>
-                <w:color w:val="1D1D1B"/>
-                <w:sz w:val="20"/>
-                <w:szCs w:val="20"/>
-              </w:rPr>
-              <w:t xml:space="preserve">Approved Direct Delivery Costs</w:t>
-            </w:r>
-          </w:p>
-        </w:tc>
-        <w:tc>
-          <w:tcPr>
-            <w:tcW w:type="dxa" w:w="2500"/>
-            <w:tcMar>
-              <w:top w:type="dxa" w:w="80"/>
-              <w:left w:type="dxa" w:w="120"/>
-              <w:bottom w:type="dxa" w:w="80"/>
-              <w:right w:type="dxa" w:w="120"/>
-            </w:tcMar>
-          </w:tcPr>
-          <w:p>
-            <w:r>
-              <w:rPr>
-                <w:rFonts w:ascii="Open Sans" w:cs="Open Sans" w:eastAsia="Open Sans" w:hAnsi="Open Sans"/>
-                <w:b w:val="false"/>
-                <w:bCs w:val="false"/>
-                <w:color w:val="1D1D1B"/>
-                <w:sz w:val="20"/>
-                <w:szCs w:val="20"/>
-              </w:rPr>
-              <w:t xml:space="preserve">$55,000</w:t>
-            </w:r>
-          </w:p>
-        </w:tc>
-        <w:tc>
-          <w:tcPr>
-            <w:tcW w:type="dxa" w:w="2500"/>
-            <w:tcMar>
-              <w:top w:type="dxa" w:w="80"/>
-              <w:left w:type="dxa" w:w="120"/>
-              <w:bottom w:type="dxa" w:w="80"/>
-              <w:right w:type="dxa" w:w="120"/>
-            </w:tcMar>
-          </w:tcPr>
-          <w:p>
-            <w:r>
-              <w:rPr>
-                <w:rFonts w:ascii="Open Sans" w:cs="Open Sans" w:eastAsia="Open Sans" w:hAnsi="Open Sans"/>
-                <w:b w:val="false"/>
-                <w:bCs w:val="false"/>
-                <w:color w:val="1D1D1B"/>
-                <w:sz w:val="20"/>
-                <w:szCs w:val="20"/>
-              </w:rPr>
-              <w:t xml:space="preserve">$65,000</w:t>
-            </w:r>
-          </w:p>
-        </w:tc>
-      </w:tr>
-      <w:tr>
-        <w:tc>
-          <w:tcPr>
-            <w:tcW w:type="dxa" w:w="2500"/>
-            <w:tcMar>
-              <w:top w:type="dxa" w:w="80"/>
-              <w:left w:type="dxa" w:w="120"/>
-              <w:bottom w:type="dxa" w:w="80"/>
-              <w:right w:type="dxa" w:w="120"/>
-            </w:tcMar>
-          </w:tcPr>
-          <w:p>
-            <w:r>
-              <w:rPr>
-                <w:rFonts w:ascii="Open Sans" w:cs="Open Sans" w:eastAsia="Open Sans" w:hAnsi="Open Sans"/>
-                <w:b w:val="false"/>
-                <w:bCs w:val="false"/>
-                <w:color w:val="1D1D1B"/>
-                <w:sz w:val="20"/>
-                <w:szCs w:val="20"/>
-              </w:rPr>
-              <w:t xml:space="preserve">Gross Margin %</w:t>
-            </w:r>
-          </w:p>
-        </w:tc>
-        <w:tc>
-          <w:tcPr>
-            <w:tcW w:type="dxa" w:w="2500"/>
-            <w:tcMar>
-              <w:top w:type="dxa" w:w="80"/>
-              <w:left w:type="dxa" w:w="120"/>
-              <w:bottom w:type="dxa" w:w="80"/>
-              <w:right w:type="dxa" w:w="120"/>
-            </w:tcMar>
-          </w:tcPr>
-          <w:p>
-            <w:r>
-              <w:rPr>
-                <w:rFonts w:ascii="Open Sans" w:cs="Open Sans" w:eastAsia="Open Sans" w:hAnsi="Open Sans"/>
-                <w:b w:val="false"/>
-                <w:bCs w:val="false"/>
-                <w:color w:val="1D1D1B"/>
-                <w:sz w:val="20"/>
-                <w:szCs w:val="20"/>
-              </w:rPr>
-              <w:t xml:space="preserve">45%</w:t>
-            </w:r>
-          </w:p>
-        </w:tc>
-        <w:tc>
-          <w:tcPr>
-            <w:tcW w:type="dxa" w:w="2500"/>
-            <w:tcMar>
-              <w:top w:type="dxa" w:w="80"/>
-              <w:left w:type="dxa" w:w="120"/>
-              <w:bottom w:type="dxa" w:w="80"/>
-              <w:right w:type="dxa" w:w="120"/>
-            </w:tcMar>
-          </w:tcPr>
-          <w:p>
-            <w:r>
-              <w:rPr>
-                <w:rFonts w:ascii="Open Sans" w:cs="Open Sans" w:eastAsia="Open Sans" w:hAnsi="Open Sans"/>
-                <w:b w:val="false"/>
-                <w:bCs w:val="false"/>
-                <w:color w:val="1D1D1B"/>
-                <w:sz w:val="20"/>
-                <w:szCs w:val="20"/>
-              </w:rPr>
-              <w:t xml:space="preserve">35%</w:t>
-            </w:r>
-          </w:p>
-        </w:tc>
-      </w:tr>
-      <w:tr>
-        <w:tc>
-          <w:tcPr>
-            <w:tcW w:type="dxa" w:w="2500"/>
+                <w:color w:val="1D1D1B"/>
+                <w:sz w:val="20"/>
+                <w:szCs w:val="20"/>
+              </w:rPr>
+              <w:t xml:space="preserve">Commission (Tier 1 rate, first $250K)</w:t>
+            </w:r>
+          </w:p>
+        </w:tc>
+        <w:tc>
+          <w:tcPr>
+            <w:tcW w:type="dxa" w:w="4000"/>
             <w:shd w:fill="FFE4EA" w:val="clear"/>
             <w:tcMar>
               <w:top w:type="dxa" w:w="80"/>
@@ -1195,57 +1122,7 @@
                 <w:sz w:val="20"/>
                 <w:szCs w:val="20"/>
               </w:rPr>
-              <w:t xml:space="preserve">Commission basis (Tier 1 rate, first $250K)</w:t>
-            </w:r>
-          </w:p>
-        </w:tc>
-        <w:tc>
-          <w:tcPr>
-            <w:tcW w:type="dxa" w:w="2500"/>
-            <w:shd w:fill="FFE4EA" w:val="clear"/>
-            <w:tcMar>
-              <w:top w:type="dxa" w:w="80"/>
-              <w:left w:type="dxa" w:w="120"/>
-              <w:bottom w:type="dxa" w:w="80"/>
-              <w:right w:type="dxa" w:w="120"/>
-            </w:tcMar>
-          </w:tcPr>
-          <w:p>
-            <w:r>
-              <w:rPr>
-                <w:rFonts w:ascii="Open Sans" w:cs="Open Sans" w:eastAsia="Open Sans" w:hAnsi="Open Sans"/>
-                <w:b/>
-                <w:bCs/>
-                <w:color w:val="1D1D1B"/>
-                <w:sz w:val="20"/>
-                <w:szCs w:val="20"/>
-              </w:rPr>
               <w:t xml:space="preserve">10% × $100,000 = $10,000</w:t>
-            </w:r>
-          </w:p>
-        </w:tc>
-        <w:tc>
-          <w:tcPr>
-            <w:tcW w:type="dxa" w:w="2500"/>
-            <w:shd w:fill="FFE4EA" w:val="clear"/>
-            <w:tcMar>
-              <w:top w:type="dxa" w:w="80"/>
-              <w:left w:type="dxa" w:w="120"/>
-              <w:bottom w:type="dxa" w:w="80"/>
-              <w:right w:type="dxa" w:w="120"/>
-            </w:tcMar>
-          </w:tcPr>
-          <w:p>
-            <w:r>
-              <w:rPr>
-                <w:rFonts w:ascii="Open Sans" w:cs="Open Sans" w:eastAsia="Open Sans" w:hAnsi="Open Sans"/>
-                <w:b/>
-                <w:bCs/>
-                <w:color w:val="1D1D1B"/>
-                <w:sz w:val="20"/>
-                <w:szCs w:val="20"/>
-              </w:rPr>
-              <w:t xml:space="preserve">6% × $100,000 = $6,000</w:t>
             </w:r>
           </w:p>
         </w:tc>
@@ -1262,7 +1139,7 @@
           <w:sz w:val="21"/>
           <w:szCs w:val="21"/>
         </w:rPr>
-        <w:t xml:space="preserve">Same revenue, same tier — but the thin-margin deal falls below the 40% Gross Margin % threshold, so it pays the reduced rate instead of the standard rate. Whether the project later runs over or under budget, the commission is fixed at the amount set when Margin Integrity Approval was granted.</w:t>
+        <w:t xml:space="preserve">Whether the project later runs over or under budget, the commission is fixed at the amount set when Margin Integrity Approval was granted. See Section 4.4 for how a thin-margin quote (below 30%) is handled instead.</w:t>
       </w:r>
     </w:p>
     <w:p>
@@ -1342,7 +1219,7 @@
           <w:sz w:val="21"/>
           <w:szCs w:val="21"/>
         </w:rPr>
-        <w:t xml:space="preserve">For engagements with a Gross Margin % of 40% or higher, the Commission Rate is a percentage of Approved Contract Value (Revenue), stepping up with Cumulative Named-Account Revenue during the Plan Year. Rates are incremental (marginal): each rate applies only to the revenue falling within that band — crossing a threshold does not retroactively change the rate on earlier revenue. If a single engagement spans a threshold, its Approved Contract Value is apportioned pro-rata between the bands.</w:t>
+        <w:t xml:space="preserve">The Commission Rate is a percentage of Approved Contract Value (Revenue), stepping up with Cumulative Named-Account Revenue during the Plan Year. Rates are incremental (marginal): each rate applies only to the revenue falling within that band — crossing a threshold does not retroactively change the rate on earlier revenue. If a single engagement spans a threshold, its Approved Contract Value is apportioned pro-rata between the bands.</w:t>
       </w:r>
     </w:p>
     <w:tbl>
@@ -1692,7 +1569,7 @@
           <w:sz w:val="21"/>
           <w:szCs w:val="21"/>
         </w:rPr>
-        <w:t xml:space="preserve">Before any customer proposal is sent and before a Commission Rate is agreed for that engagement, Bill Gusmano (or his written designee) must review the Gross Margin % shown on the Approved Pricing Worksheet and grant Margin Integrity Approval in writing. This applies to every engagement regardless of Gross Margin %, including engagements at or above 40%. No commission accrues on an engagement lacking Margin Integrity Approval.</w:t>
+        <w:t xml:space="preserve">Before any customer proposal is sent and before a Commission Rate is agreed for that engagement, Bill Gusmano (or his written designee) must review the Gross Margin % shown on the Approved Pricing Worksheet and grant Margin Integrity Approval in writing. No commission accrues on an engagement lacking Margin Integrity Approval.</w:t>
       </w:r>
     </w:p>
     <w:p>
@@ -1713,344 +1590,18 @@
           <w:sz w:val="21"/>
           <w:szCs w:val="21"/>
         </w:rPr>
-        <w:t xml:space="preserve">Reduced rate schedule — Gross Margin % below 40%. </w:t>
-      </w:r>
-      <w:r>
-        <w:rPr>
-          <w:rFonts w:ascii="Open Sans" w:cs="Open Sans" w:eastAsia="Open Sans" w:hAnsi="Open Sans"/>
-          <w:color w:val="1D1D1B"/>
-          <w:sz w:val="21"/>
-          <w:szCs w:val="21"/>
-        </w:rPr>
-        <w:t xml:space="preserve">If the Gross Margin % shown on the Approved Pricing Worksheet is below 40%, the Commission Rate for that engagement is reduced as set out below instead of the standard schedule. The reduction reflects the thinner margin available to fund commission on that specific deal — it does not affect the Sales Representative's tier position for future engagements.</w:t>
-      </w:r>
-    </w:p>
-    <w:tbl>
-      <w:tblPr>
-        <w:tblW w:type="dxa" w:w="9360"/>
-        <w:tblBorders>
-          <w:top w:val="single" w:color="auto" w:sz="4"/>
-          <w:left w:val="single" w:color="auto" w:sz="4"/>
-          <w:bottom w:val="single" w:color="auto" w:sz="4"/>
-          <w:right w:val="single" w:color="auto" w:sz="4"/>
-          <w:insideH w:val="single" w:color="auto" w:sz="4"/>
-          <w:insideV w:val="single" w:color="auto" w:sz="4"/>
-        </w:tblBorders>
-      </w:tblPr>
-      <w:tblGrid>
-        <w:gridCol w:w="900"/>
-        <w:gridCol w:w="5400"/>
-        <w:gridCol w:w="3060"/>
-      </w:tblGrid>
-      <w:tr>
-        <w:tc>
-          <w:tcPr>
-            <w:tcW w:type="dxa" w:w="900"/>
-            <w:shd w:fill="1D1D1B" w:val="clear"/>
-            <w:tcMar>
-              <w:top w:type="dxa" w:w="80"/>
-              <w:left w:type="dxa" w:w="120"/>
-              <w:bottom w:type="dxa" w:w="80"/>
-              <w:right w:type="dxa" w:w="120"/>
-            </w:tcMar>
-          </w:tcPr>
-          <w:p>
-            <w:r>
-              <w:rPr>
-                <w:rFonts w:ascii="Open Sans" w:cs="Open Sans" w:eastAsia="Open Sans" w:hAnsi="Open Sans"/>
-                <w:b/>
-                <w:bCs/>
-                <w:color w:val="FFFFFF"/>
-                <w:sz w:val="20"/>
-                <w:szCs w:val="20"/>
-              </w:rPr>
-              <w:t xml:space="preserve">Tier</w:t>
-            </w:r>
-          </w:p>
-        </w:tc>
-        <w:tc>
-          <w:tcPr>
-            <w:tcW w:type="dxa" w:w="5400"/>
-            <w:shd w:fill="1D1D1B" w:val="clear"/>
-            <w:tcMar>
-              <w:top w:type="dxa" w:w="80"/>
-              <w:left w:type="dxa" w:w="120"/>
-              <w:bottom w:type="dxa" w:w="80"/>
-              <w:right w:type="dxa" w:w="120"/>
-            </w:tcMar>
-          </w:tcPr>
-          <w:p>
-            <w:r>
-              <w:rPr>
-                <w:rFonts w:ascii="Open Sans" w:cs="Open Sans" w:eastAsia="Open Sans" w:hAnsi="Open Sans"/>
-                <w:b/>
-                <w:bCs/>
-                <w:color w:val="FFFFFF"/>
-                <w:sz w:val="20"/>
-                <w:szCs w:val="20"/>
-              </w:rPr>
-              <w:t xml:space="preserve">Cumulative Named-Account Revenue (Plan Year)</w:t>
-            </w:r>
-          </w:p>
-        </w:tc>
-        <w:tc>
-          <w:tcPr>
-            <w:tcW w:type="dxa" w:w="3060"/>
-            <w:shd w:fill="1D1D1B" w:val="clear"/>
-            <w:tcMar>
-              <w:top w:type="dxa" w:w="80"/>
-              <w:left w:type="dxa" w:w="120"/>
-              <w:bottom w:type="dxa" w:w="80"/>
-              <w:right w:type="dxa" w:w="120"/>
-            </w:tcMar>
-          </w:tcPr>
-          <w:p>
-            <w:r>
-              <w:rPr>
-                <w:rFonts w:ascii="Open Sans" w:cs="Open Sans" w:eastAsia="Open Sans" w:hAnsi="Open Sans"/>
-                <w:b/>
-                <w:bCs/>
-                <w:color w:val="FFFFFF"/>
-                <w:sz w:val="20"/>
-                <w:szCs w:val="20"/>
-              </w:rPr>
-              <w:t xml:space="preserve">Reduced Commission Rate (Gross Margin % &lt; 40%)</w:t>
-            </w:r>
-          </w:p>
-        </w:tc>
-      </w:tr>
-      <w:tr>
-        <w:tc>
-          <w:tcPr>
-            <w:tcW w:type="dxa" w:w="900"/>
-            <w:shd w:fill="FFF3D6" w:val="clear"/>
-            <w:tcMar>
-              <w:top w:type="dxa" w:w="80"/>
-              <w:left w:type="dxa" w:w="120"/>
-              <w:bottom w:type="dxa" w:w="80"/>
-              <w:right w:type="dxa" w:w="120"/>
-            </w:tcMar>
-          </w:tcPr>
-          <w:p>
-            <w:r>
-              <w:rPr>
-                <w:rFonts w:ascii="Open Sans" w:cs="Open Sans" w:eastAsia="Open Sans" w:hAnsi="Open Sans"/>
-                <w:b w:val="false"/>
-                <w:bCs w:val="false"/>
-                <w:color w:val="1D1D1B"/>
-                <w:sz w:val="20"/>
-                <w:szCs w:val="20"/>
-              </w:rPr>
-              <w:t xml:space="preserve">1</w:t>
-            </w:r>
-          </w:p>
-        </w:tc>
-        <w:tc>
-          <w:tcPr>
-            <w:tcW w:type="dxa" w:w="5400"/>
-            <w:shd w:fill="FFF3D6" w:val="clear"/>
-            <w:tcMar>
-              <w:top w:type="dxa" w:w="80"/>
-              <w:left w:type="dxa" w:w="120"/>
-              <w:bottom w:type="dxa" w:w="80"/>
-              <w:right w:type="dxa" w:w="120"/>
-            </w:tcMar>
-          </w:tcPr>
-          <w:p>
-            <w:r>
-              <w:rPr>
-                <w:rFonts w:ascii="Open Sans" w:cs="Open Sans" w:eastAsia="Open Sans" w:hAnsi="Open Sans"/>
-                <w:b w:val="false"/>
-                <w:bCs w:val="false"/>
-                <w:color w:val="1D1D1B"/>
-                <w:sz w:val="20"/>
-                <w:szCs w:val="20"/>
-              </w:rPr>
-              <w:t xml:space="preserve">First $250,000</w:t>
-            </w:r>
-          </w:p>
-        </w:tc>
-        <w:tc>
-          <w:tcPr>
-            <w:tcW w:type="dxa" w:w="3060"/>
-            <w:shd w:fill="FFF3D6" w:val="clear"/>
-            <w:tcMar>
-              <w:top w:type="dxa" w:w="80"/>
-              <w:left w:type="dxa" w:w="120"/>
-              <w:bottom w:type="dxa" w:w="80"/>
-              <w:right w:type="dxa" w:w="120"/>
-            </w:tcMar>
-          </w:tcPr>
-          <w:p>
-            <w:r>
-              <w:rPr>
-                <w:rFonts w:ascii="Open Sans" w:cs="Open Sans" w:eastAsia="Open Sans" w:hAnsi="Open Sans"/>
-                <w:b w:val="false"/>
-                <w:bCs w:val="false"/>
-                <w:color w:val="1D1D1B"/>
-                <w:sz w:val="20"/>
-                <w:szCs w:val="20"/>
-              </w:rPr>
-              <w:t xml:space="preserve">6%</w:t>
-            </w:r>
-          </w:p>
-        </w:tc>
-      </w:tr>
-      <w:tr>
-        <w:tc>
-          <w:tcPr>
-            <w:tcW w:type="dxa" w:w="900"/>
-            <w:shd w:fill="FFF3D6" w:val="clear"/>
-            <w:tcMar>
-              <w:top w:type="dxa" w:w="80"/>
-              <w:left w:type="dxa" w:w="120"/>
-              <w:bottom w:type="dxa" w:w="80"/>
-              <w:right w:type="dxa" w:w="120"/>
-            </w:tcMar>
-          </w:tcPr>
-          <w:p>
-            <w:r>
-              <w:rPr>
-                <w:rFonts w:ascii="Open Sans" w:cs="Open Sans" w:eastAsia="Open Sans" w:hAnsi="Open Sans"/>
-                <w:b w:val="false"/>
-                <w:bCs w:val="false"/>
-                <w:color w:val="1D1D1B"/>
-                <w:sz w:val="20"/>
-                <w:szCs w:val="20"/>
-              </w:rPr>
-              <w:t xml:space="preserve">2</w:t>
-            </w:r>
-          </w:p>
-        </w:tc>
-        <w:tc>
-          <w:tcPr>
-            <w:tcW w:type="dxa" w:w="5400"/>
-            <w:shd w:fill="FFF3D6" w:val="clear"/>
-            <w:tcMar>
-              <w:top w:type="dxa" w:w="80"/>
-              <w:left w:type="dxa" w:w="120"/>
-              <w:bottom w:type="dxa" w:w="80"/>
-              <w:right w:type="dxa" w:w="120"/>
-            </w:tcMar>
-          </w:tcPr>
-          <w:p>
-            <w:r>
-              <w:rPr>
-                <w:rFonts w:ascii="Open Sans" w:cs="Open Sans" w:eastAsia="Open Sans" w:hAnsi="Open Sans"/>
-                <w:b w:val="false"/>
-                <w:bCs w:val="false"/>
-                <w:color w:val="1D1D1B"/>
-                <w:sz w:val="20"/>
-                <w:szCs w:val="20"/>
-              </w:rPr>
-              <w:t xml:space="preserve">Over $250,000 up to $500,000</w:t>
-            </w:r>
-          </w:p>
-        </w:tc>
-        <w:tc>
-          <w:tcPr>
-            <w:tcW w:type="dxa" w:w="3060"/>
-            <w:shd w:fill="FFF3D6" w:val="clear"/>
-            <w:tcMar>
-              <w:top w:type="dxa" w:w="80"/>
-              <w:left w:type="dxa" w:w="120"/>
-              <w:bottom w:type="dxa" w:w="80"/>
-              <w:right w:type="dxa" w:w="120"/>
-            </w:tcMar>
-          </w:tcPr>
-          <w:p>
-            <w:r>
-              <w:rPr>
-                <w:rFonts w:ascii="Open Sans" w:cs="Open Sans" w:eastAsia="Open Sans" w:hAnsi="Open Sans"/>
-                <w:b w:val="false"/>
-                <w:bCs w:val="false"/>
-                <w:color w:val="1D1D1B"/>
-                <w:sz w:val="20"/>
-                <w:szCs w:val="20"/>
-              </w:rPr>
-              <w:t xml:space="preserve">7%</w:t>
-            </w:r>
-          </w:p>
-        </w:tc>
-      </w:tr>
-      <w:tr>
-        <w:tc>
-          <w:tcPr>
-            <w:tcW w:type="dxa" w:w="900"/>
-            <w:shd w:fill="FFF3D6" w:val="clear"/>
-            <w:tcMar>
-              <w:top w:type="dxa" w:w="80"/>
-              <w:left w:type="dxa" w:w="120"/>
-              <w:bottom w:type="dxa" w:w="80"/>
-              <w:right w:type="dxa" w:w="120"/>
-            </w:tcMar>
-          </w:tcPr>
-          <w:p>
-            <w:r>
-              <w:rPr>
-                <w:rFonts w:ascii="Open Sans" w:cs="Open Sans" w:eastAsia="Open Sans" w:hAnsi="Open Sans"/>
-                <w:b/>
-                <w:bCs/>
-                <w:color w:val="1D1D1B"/>
-                <w:sz w:val="20"/>
-                <w:szCs w:val="20"/>
-              </w:rPr>
-              <w:t xml:space="preserve">3</w:t>
-            </w:r>
-          </w:p>
-        </w:tc>
-        <w:tc>
-          <w:tcPr>
-            <w:tcW w:type="dxa" w:w="5400"/>
-            <w:shd w:fill="FFF3D6" w:val="clear"/>
-            <w:tcMar>
-              <w:top w:type="dxa" w:w="80"/>
-              <w:left w:type="dxa" w:w="120"/>
-              <w:bottom w:type="dxa" w:w="80"/>
-              <w:right w:type="dxa" w:w="120"/>
-            </w:tcMar>
-          </w:tcPr>
-          <w:p>
-            <w:r>
-              <w:rPr>
-                <w:rFonts w:ascii="Open Sans" w:cs="Open Sans" w:eastAsia="Open Sans" w:hAnsi="Open Sans"/>
-                <w:b/>
-                <w:bCs/>
-                <w:color w:val="1D1D1B"/>
-                <w:sz w:val="20"/>
-                <w:szCs w:val="20"/>
-              </w:rPr>
-              <w:t xml:space="preserve">Over $500,000</w:t>
-            </w:r>
-          </w:p>
-        </w:tc>
-        <w:tc>
-          <w:tcPr>
-            <w:tcW w:type="dxa" w:w="3060"/>
-            <w:shd w:fill="FFF3D6" w:val="clear"/>
-            <w:tcMar>
-              <w:top w:type="dxa" w:w="80"/>
-              <w:left w:type="dxa" w:w="120"/>
-              <w:bottom w:type="dxa" w:w="80"/>
-              <w:right w:type="dxa" w:w="120"/>
-            </w:tcMar>
-          </w:tcPr>
-          <w:p>
-            <w:r>
-              <w:rPr>
-                <w:rFonts w:ascii="Open Sans" w:cs="Open Sans" w:eastAsia="Open Sans" w:hAnsi="Open Sans"/>
-                <w:b/>
-                <w:bCs/>
-                <w:color w:val="1D1D1B"/>
-                <w:sz w:val="20"/>
-                <w:szCs w:val="20"/>
-              </w:rPr>
-              <w:t xml:space="preserve">9% (cap)</w:t>
-            </w:r>
-          </w:p>
-        </w:tc>
-      </w:tr>
-    </w:tbl>
+        <w:t xml:space="preserve">Margin protection below 30%. </w:t>
+      </w:r>
+      <w:r>
+        <w:rPr>
+          <w:rFonts w:ascii="Open Sans" w:cs="Open Sans" w:eastAsia="Open Sans" w:hAnsi="Open Sans"/>
+          <w:color w:val="1D1D1B"/>
+          <w:sz w:val="21"/>
+          <w:szCs w:val="21"/>
+        </w:rPr>
+        <w:t xml:space="preserve">If the Gross Margin % shown on the Approved Pricing Worksheet is below 30%, this engagement is commissioned on Gross Profit instead of Revenue, split 60/40 between MMG and the Sales Representative: commission = 40% of the engagement's Gross Profit (Approved Contract Value less Approved Direct Delivery Costs), with MMG retaining the remaining 60%. For example, a $100,000 quote at 25% Gross Margin has Gross Profit of $25,000, so commission is 40% × $25,000 = $10,000. This scales automatically with how thin the margin is — it is not a flat penalty — and applies only to that engagement; it does not change the Sales Representative's tier position under Section 4.2 for other engagements.</w:t>
+      </w:r>
+    </w:p>
     <w:p>
       <w:pPr>
         <w:pStyle w:val="ListParagraph"/>
@@ -2067,7 +1618,7 @@
           <w:sz w:val="21"/>
           <w:szCs w:val="21"/>
         </w:rPr>
-        <w:t xml:space="preserve">The applicable tier, Gross Margin %, and resulting Commission Rate (standard or reduced) for an engagement are fixed at Margin Integrity Approval, based on Cumulative Named-Account Revenue at that time, and are stated on the Approved Pricing Worksheet.</w:t>
+        <w:t xml:space="preserve">The applicable Commission Rate or Gross Profit split for an engagement is fixed at Margin Integrity Approval, based on the Gross Margin % and Cumulative Named-Account Revenue at that time, and is stated on the Approved Pricing Worksheet.</w:t>
       </w:r>
     </w:p>
     <w:p>
@@ -2110,25 +1661,6 @@
     </w:p>
     <w:p>
       <w:pPr>
-        <w:pStyle w:val="ListParagraph"/>
-        <w:numPr>
-          <w:ilvl w:val="0"/>
-          <w:numId w:val="3"/>
-        </w:numPr>
-        <w:spacing w:after="140" w:line="300"/>
-      </w:pPr>
-      <w:r>
-        <w:rPr>
-          <w:rFonts w:ascii="Open Sans" w:cs="Open Sans" w:eastAsia="Open Sans" w:hAnsi="Open Sans"/>
-          <w:color w:val="1D1D1B"/>
-          <w:sz w:val="21"/>
-          <w:szCs w:val="21"/>
-        </w:rPr>
-        <w:t xml:space="preserve">Discounts approved by MMG management before Margin Integrity Approval are reflected in the Approved Contract Value and Gross Margin % used for that approval. Post-approval discounts or concessions granted by MMG without a Change Order do not change the Commission Rate.</w:t>
-      </w:r>
-    </w:p>
-    <w:p>
-      <w:pPr>
         <w:pStyle w:val="Heading2"/>
         <w:pBdr>
           <w:bottom w:val="single" w:color="FF97A9" w:sz="12" w:space="2"/>
@@ -2592,7 +2124,7 @@
           <w:sz w:val="21"/>
           <w:szCs w:val="21"/>
         </w:rPr>
-        <w:t xml:space="preserve">This Agreement may be amended only in a writing signed by both Parties. MMG may amend the Commission Rate schedules or the 40% Gross Margin % threshold prospectively for future engagements upon thirty (30) days' written notice.</w:t>
+        <w:t xml:space="preserve">This Agreement may be amended only in a writing signed by both Parties. MMG may amend the Commission Rate schedules or the 30% Gross Margin % threshold prospectively for future engagements upon thirty (30) days' written notice.</w:t>
       </w:r>
     </w:p>
     <w:p>

</xml_diff>